<commit_message>
Revise final report draft one
</commit_message>
<xml_diff>
--- a/output/docx/MLentz_Final_Project_Business_Report_Draft_1.docx
+++ b/output/docx/MLentz_Final_Project_Business_Report_Draft_1.docx
@@ -151,20 +151,18 @@
       <w:r>
         <w:rPr>
           <w:rFonts w:ascii="Times New Roman" w:hAnsi="Times New Roman"/>
-          <w:color w:val="000000"/>
           <w:sz w:val="24"/>
         </w:rPr>
-        <w:t>The Vinyl Concierge is an AI-powered recommendation and decision-support platform for independent record stores. It addresses two connected problems: customers often want warmer, more personal music discovery than generic streaming algorithms provide, while store owners must make inventory decisions with limited visibility into emerging customer interests. The product connects those two needs by turning customer recommendation activity into de-identified owner intelligence.</w:t>
+        <w:t>The Vinyl Concierge is an AI-powered recommendation and decision-support platform for independent record stores. It addresses two connected problems: customers often want warmer, more personal music discovery than generic streaming algorithms provide, while store owners must make inventory decisions with limited visibility into emerging customer interests. The product connects those two needs by turning customer recommendation activity into privacy-protected owner intelligence.</w:t>
       </w:r>
     </w:p>
     <w:p>
       <w:r>
         <w:rPr>
           <w:rFonts w:ascii="Times New Roman" w:hAnsi="Times New Roman"/>
-          <w:color w:val="000000"/>
           <w:sz w:val="24"/>
         </w:rPr>
-        <w:t>The current prototype lets customers sign in, enter favorite artists or genres, receive five vinyl recommendations from a limited demo catalog, and respond with saved-interest, thumbs-up, or thumbs-down signals. Those interactions can be saved in Firebase and converted into owner-facing demand signals. The Owner Intelligence Dashboard then reviews album, artist, and genre patterns as cautious sourcing signals rather than automated purchase instructions.</w:t>
+        <w:t>The current prototype lets customers sign in, enter favorite artists or genres, receive five vinyl recommendations from a limited demo catalog, and respond with saved-interest, thumbs-up, or thumbs-down signals. In the implemented prototype, signed-in sessions are saved in Firestore, and recommendation requests or response actions can also create owner-facing interest signals. The Owner Intelligence Dashboard then reviews album, artist, and genre patterns as cautious sourcing signals rather than automated purchase instructions.</w:t>
       </w:r>
     </w:p>
     <w:p>
@@ -181,20 +179,18 @@
       <w:r>
         <w:rPr>
           <w:rFonts w:ascii="Times New Roman" w:hAnsi="Times New Roman"/>
-          <w:color w:val="000000"/>
           <w:sz w:val="24"/>
         </w:rPr>
-        <w:t>The main business conclusion is that The Vinyl Concierge is worth a limited pilot, not broad deployment. The prototype demonstrates a coherent customer-to-owner feedback loop, but it is not yet a production SaaS product. A commercial version would need live inventory integration, POS or ecommerce connections, purchase validation, stronger monitoring, and store-specific rollout support. The strongest value proposition is not the recommendation engine alone; it is the decision-support loop that connects customer discovery, de-identified interest signals, owner review, and future inventory planning.</w:t>
+        <w:t>The main business conclusion is that The Vinyl Concierge is not ready for deployment until the operating integrations are in place. The prototype demonstrates a coherent customer-to-owner feedback loop, but even a limited commercial pilot would need live inventory integration, POS or ecommerce connections, purchase validation, stronger monitoring, and store-specific rollout support. The strongest value proposition is not the recommendation engine alone; it is the decision-support loop that connects customer discovery, privacy-protected interest signals, owner review, and inventory planning.</w:t>
       </w:r>
     </w:p>
     <w:p>
       <w:r>
         <w:rPr>
           <w:rFonts w:ascii="Times New Roman" w:hAnsi="Times New Roman"/>
-          <w:color w:val="000000"/>
           <w:sz w:val="24"/>
         </w:rPr>
-        <w:t>Known limitations are material but manageable if the product remains transparent. Recommendation activity is not the same as purchase intent; the demo catalog is limited; the current interface assumes English-speaking users comfortable with record-store vocabulary; and owner dashboards could create automation bias if signals are overstated. Responsible deployment therefore requires clear labeling, role-based access, de-identified owner analytics, human review, and governance triggers for complaints, data drift, suspicious demand spikes, and inventory mismatches.</w:t>
+        <w:t>Known limitations are material but manageable if the product remains transparent. Recommendation activity is not the same as purchase intent; the demo catalog is limited; the current interface assumes English-speaking users comfortable with record-store vocabulary; and owner dashboards could create automation bias if signals are overstated. Responsible deployment therefore requires clear labeling, role-based access, anonymized owner analytics, human review, and governance triggers for complaints, data drift, suspicious demand spikes, and inventory mismatches.</w:t>
       </w:r>
     </w:p>
     <w:p>
@@ -239,10 +235,9 @@
       <w:r>
         <w:rPr>
           <w:rFonts w:ascii="Times New Roman" w:hAnsi="Times New Roman"/>
-          <w:color w:val="000000"/>
           <w:sz w:val="24"/>
         </w:rPr>
-        <w:t>The Vinyl Concierge frames recommendation activity as a business signal. Instead of treating AI recommendations as an isolated customer feature, the product asks whether customer discovery behavior can also help a store owner understand demand. The core product logic is that the same interaction that helps a customer discover records can, if handled responsibly, create de-identified signals for inventory planning.</w:t>
+        <w:t>The Vinyl Concierge frames recommendation activity as a business signal. Instead of treating AI recommendations as an isolated customer feature, the product asks whether customer discovery behavior can also help a store owner understand demand. The core product logic is that the same interaction that helps a customer discover records can, if handled responsibly, create anonymized signals for inventory planning.</w:t>
       </w:r>
     </w:p>
     <w:tbl>
@@ -475,10 +470,9 @@
             <w:r>
               <w:rPr>
                 <w:rFonts w:ascii="Times New Roman" w:hAnsi="Times New Roman"/>
-                <w:color w:val="000000"/>
                 <w:sz w:val="24"/>
               </w:rPr>
-              <w:t>Reviews de-identified recommendation activity, saved-interest responses, and cautious sourcing suggestions in Owner Intelligence.</w:t>
+              <w:t>Reviews anonymized recommendation activity, saved-interest responses, and cautious sourcing suggestions in Owner Intelligence.</w:t>
             </w:r>
           </w:p>
         </w:tc>
@@ -618,10 +612,9 @@
       <w:r>
         <w:rPr>
           <w:rFonts w:ascii="Times New Roman" w:hAnsi="Times New Roman"/>
-          <w:color w:val="000000"/>
           <w:sz w:val="24"/>
         </w:rPr>
-        <w:t>The project evolved across the course from a customer-facing AI recommendation idea into a prototype that includes business intelligence, backend persistence, feedback integration, bias analysis, and deployment judgment. The most important evolution was a shift from output generation to decision support.</w:t>
+        <w:t>The project evolved from a customer-facing AI recommendation idea for one independent record store into a broader subscription SaaS concept that could serve multiple stores. The most important evolution was a shift from output generation to decision support: the product became less about producing a single recommendation stack and more about helping record stores turn customer discovery behavior into operational insight.</w:t>
       </w:r>
     </w:p>
     <w:tbl>
@@ -974,10 +967,9 @@
             <w:r>
               <w:rPr>
                 <w:rFonts w:ascii="Times New Roman" w:hAnsi="Times New Roman"/>
-                <w:color w:val="000000"/>
                 <w:sz w:val="24"/>
               </w:rPr>
-              <w:t>Added Firebase Authentication, Firestore catalog reads, private sessions, de-identified demand signals, and role-sensitive owner access.</w:t>
+              <w:t>Added Firebase Authentication, Firestore catalog reads, private sessions, anonymized interest signals, and role-sensitive owner access.</w:t>
             </w:r>
           </w:p>
         </w:tc>
@@ -1221,10 +1213,9 @@
       <w:r>
         <w:rPr>
           <w:rFonts w:ascii="Times New Roman" w:hAnsi="Times New Roman"/>
-          <w:color w:val="000000"/>
           <w:sz w:val="24"/>
         </w:rPr>
-        <w:t>Temporary localization as learning, not final scope: The Week 6 Mexico-focused route was useful for bias and global-audience analysis, but it is not part of the final prototype experience.</w:t>
+        <w:t>Market scope discipline: The product can eventually support localized store experiences, but the current business case should first prove the core U.S. independent-record-store workflow before expanding into additional markets.</w:t>
       </w:r>
     </w:p>
     <w:p>
@@ -1245,10 +1236,9 @@
       <w:r>
         <w:rPr>
           <w:rFonts w:ascii="Times New Roman" w:hAnsi="Times New Roman"/>
-          <w:color w:val="000000"/>
           <w:sz w:val="24"/>
         </w:rPr>
-        <w:t>The current GitHub Pages prototype includes two connected experiences: a customer recommendation flow and an owner intelligence flow. The customer side is the entry point, while the owner side demonstrates how de-identified recommendation activity can become business intelligence.</w:t>
+        <w:t>The current prototype includes two connected experiences: a customer recommendation flow and an owner intelligence flow. The customer side is the entry point, while the owner side demonstrates how anonymized recommendation activity can become business intelligence.</w:t>
       </w:r>
     </w:p>
     <w:p>
@@ -1364,10 +1354,9 @@
       <w:r>
         <w:rPr>
           <w:rFonts w:ascii="Times New Roman" w:hAnsi="Times New Roman"/>
-          <w:color w:val="000000"/>
           <w:sz w:val="24"/>
         </w:rPr>
-        <w:t>Step 2: The dashboard distinguishes live de-identified interest signals from synthetic inventory, revenue, and outcome examples.</w:t>
+        <w:t>Step 2: The dashboard distinguishes live anonymized interest signals from synthetic inventory, revenue, and outcome examples.</w:t>
       </w:r>
     </w:p>
     <w:p>
@@ -1413,10 +1402,9 @@
       <w:r>
         <w:rPr>
           <w:rFonts w:ascii="Times New Roman" w:hAnsi="Times New Roman"/>
-          <w:color w:val="000000"/>
           <w:sz w:val="24"/>
         </w:rPr>
-        <w:t>The professor walkthrough path demonstrates this loop directly: a tester signs in, generates recommendations, marks interest or feedback on a record, and opens the same session in Owner Intelligence. This is the strongest current evidence that the prototype has moved beyond a static interface into a connected workflow.</w:t>
+        <w:t>A workflow demonstration shows this loop directly: a user signs in, generates recommendations, marks interest or feedback on a record, and opens the same session in Owner Intelligence. This is the strongest current evidence that the prototype has moved beyond a static interface into a connected workflow.</w:t>
       </w:r>
     </w:p>
     <w:p>
@@ -1437,10 +1425,9 @@
       <w:r>
         <w:rPr>
           <w:rFonts w:ascii="Times New Roman" w:hAnsi="Times New Roman"/>
-          <w:color w:val="000000"/>
           <w:sz w:val="24"/>
         </w:rPr>
-        <w:t>The current prototype is a React and Vite web application with Firebase Authentication and Firestore. It can read a Firestore-backed album catalog, fall back to local catalog data if needed, save private customer sessions under each user's profile, and write de-identified owner-readable demand signals. Firestore security rules protect role changes, validate demand-signal fields, and keep private recommendation actions under the customer's user path.</w:t>
+        <w:t>The current prototype is a React and Vite web application with Firebase Authentication and Firestore. It can read a Firestore-backed album catalog, fall back to local catalog data if needed, save private customer sessions under each user's profile, and write anonymized owner-readable interest signals. Firestore security rules protect role changes, validate signal fields, and keep private recommendation actions under the customer's user path.</w:t>
       </w:r>
     </w:p>
     <w:p>
@@ -1516,10 +1503,9 @@
       <w:r>
         <w:rPr>
           <w:rFonts w:ascii="Times New Roman" w:hAnsi="Times New Roman"/>
-          <w:color w:val="000000"/>
           <w:sz w:val="24"/>
         </w:rPr>
-        <w:t>Step 5: De-identified demand signal creation</w:t>
+        <w:t>Step 5: Anonymized interest signal creation</w:t>
       </w:r>
     </w:p>
     <w:p>
@@ -1721,10 +1707,9 @@
             <w:r>
               <w:rPr>
                 <w:rFonts w:ascii="Times New Roman" w:hAnsi="Times New Roman"/>
-                <w:color w:val="000000"/>
                 <w:sz w:val="24"/>
               </w:rPr>
-              <w:t>De-identified recommendation interest signals</w:t>
+              <w:t>Anonymized recommendation interest signals</w:t>
             </w:r>
           </w:p>
         </w:tc>
@@ -2356,20 +2341,18 @@
       <w:r>
         <w:rPr>
           <w:rFonts w:ascii="Times New Roman" w:hAnsi="Times New Roman"/>
-          <w:color w:val="000000"/>
           <w:sz w:val="24"/>
         </w:rPr>
-        <w:t>The main bias risks are representation bias, assumption bias, algorithmic availability bias, language and cultural bias, and automation bias. These risks are not abstract. Earlier testing showed that broad catalog tags could interfere with more specific country or classic-rock requests until the scoring logic was corrected. Similarly, Week 6 localization work showed that language translation alone is not enough; product tone, genre categories, trust cues, privacy expectations, and local buying habits all affect whether a recommendation system fits a market.</w:t>
+        <w:t>The main bias risks are representation bias, assumption bias, algorithmic availability bias, language and cultural bias, and automation bias. These risks are not abstract. Earlier testing showed that broad catalog tags could interfere with more specific country or classic-rock requests until the scoring logic was corrected. Market-expansion analysis also showed that language translation alone is not enough; product tone, genre categories, trust cues, privacy expectations, and local buying habits all affect whether a recommendation system fits a market.</w:t>
       </w:r>
     </w:p>
     <w:p>
       <w:r>
         <w:rPr>
           <w:rFonts w:ascii="Times New Roman" w:hAnsi="Times New Roman"/>
-          <w:color w:val="000000"/>
           <w:sz w:val="24"/>
         </w:rPr>
-        <w:t>For the final version, the Mexico-focused route is treated as temporary course evidence rather than part of the final prototype. Its lesson is still important: responsible deployment requires awareness of blind spots and local context. A production rollout outside the original U.S. independent-record-store context would need localized catalogs, genre taxonomies, privacy review, and culturally appropriate customer language.</w:t>
+        <w:t>A production rollout outside the original U.S. independent-record-store context would need localized catalogs, genre taxonomies, privacy review, and culturally appropriate customer language. This is a future-market consideration rather than a requirement for the first commercial version.</w:t>
       </w:r>
     </w:p>
     <w:p>
@@ -2419,10 +2402,9 @@
       <w:r>
         <w:rPr>
           <w:rFonts w:ascii="Times New Roman" w:hAnsi="Times New Roman"/>
-          <w:color w:val="000000"/>
           <w:sz w:val="24"/>
         </w:rPr>
-        <w:t>Customer sessions remain private, while owner intelligence uses de-identified demand signals.</w:t>
+        <w:t>Customer sessions remain private, while owner intelligence uses anonymized interest signals.</w:t>
       </w:r>
     </w:p>
     <w:p>
@@ -3248,10 +3230,9 @@
       <w:r>
         <w:rPr>
           <w:rFonts w:ascii="Times New Roman" w:hAnsi="Times New Roman"/>
-          <w:color w:val="000000"/>
           <w:sz w:val="24"/>
         </w:rPr>
-        <w:t>The ROI case depends on whether the platform can improve customer engagement, repeat visits, saved-interest behavior, and inventory decisions. A simplified Week 7 break-even judgment estimated monthly operating costs around $2,500 and suggested that a $50 monthly price per store could be realistic if the product serves approximately 50 stores in an early pilot. This is not a full financial model, but it suggests the pilot economics are plausible if the product demonstrably improves engagement or buying decisions.</w:t>
+        <w:t>The ROI case depends on whether the platform can improve customer engagement, repeat visits, saved-interest behavior, and inventory decisions. A simplified break-even judgment estimated monthly operating costs around $2,500 and suggested that a $50 monthly price per store could be realistic if the product serves approximately 50 subscribing stores. This is not a full financial model, but it suggests the economics could become plausible if the product demonstrably improves engagement or buying decisions after real inventory, purchase, and commerce integrations are in place.</w:t>
       </w:r>
     </w:p>
     <w:tbl>
@@ -3572,10 +3553,9 @@
       <w:r>
         <w:rPr>
           <w:rFonts w:ascii="Times New Roman" w:hAnsi="Times New Roman"/>
-          <w:color w:val="000000"/>
           <w:sz w:val="24"/>
         </w:rPr>
-        <w:t>The Vinyl Concierge is worth deploying as a limited pilot, not as a broad commercial release. A pilot should use one or a small number of stores, a clearly labeled catalog, explicit staff review, and careful measurement of recommendation completion, saved-interest actions, repeat visits, customer satisfaction, and owner usefulness. Broad deployment should wait until the product connects to live inventory and purchase data, because that is what would turn interest signals into stronger business intelligence.</w:t>
+        <w:t>The Vinyl Concierge is not ready for a commercial pilot in its current prototype form. Even a limited pilot would need to connect to real store inventory, ecommerce, POS data, and purchase history before the owner dashboard could responsibly support inventory decisions. Without those integrations, the system can demonstrate product logic, but it cannot yet prove whether recommendation activity leads to sales, repeat visits, or better buying decisions. The appropriate next step is an integration-ready pre-pilot phase: connect one store's catalog and transaction systems, validate data quality, define staff review procedures, and establish governance thresholds. Only after those foundations are working should the product move into a store-facing pilot.</w:t>
       </w:r>
     </w:p>
     <w:p>
@@ -3626,14 +3606,15 @@
       <w:r>
         <w:rPr>
           <w:rFonts w:ascii="Times New Roman" w:hAnsi="Times New Roman"/>
-          <w:color w:val="000000"/>
           <w:sz w:val="24"/>
         </w:rPr>
-        <w:t>If continued after the course, I would focus on a small pilot with real store inventory, purchase validation, and staff review. I would measure whether customers complete the recommendation flow, whether saved-interest signals predict any buying behavior, whether owners find the dashboard useful, and whether the system improves decisions without replacing human judgment. That is the point at which The Vinyl Concierge would move from a promising prototype to a deployable business product.</w:t>
+        <w:t>The next phase should focus on making the product pilot-ready by connecting real store inventory, ecommerce, POS data, purchase validation, and staff review. After those integrations are working, the business should measure whether customers complete the recommendation flow, whether saved-interest signals predict buying behavior, whether owners find the dashboard useful, and whether the system improves decisions without replacing human judgment. That is the point at which The Vinyl Concierge would move from a promising prototype to a deployable business product.</w:t>
       </w:r>
     </w:p>
     <w:sectPr>
       <w:footerReference w:type="default" r:id="rId9"/>
+      <w:footerReference w:type="first" r:id="rId10"/>
+      <w:footerReference w:type="even" r:id="rId11"/>
       <w:pgSz w:w="12240" w:h="15840"/>
       <w:pgMar w:top="1440" w:right="1440" w:bottom="1440" w:left="1440" w:header="708" w:footer="708" w:gutter="0"/>
       <w:cols w:space="720"/>
@@ -3650,19 +3631,29 @@
       <w:pStyle w:val="Footer"/>
       <w:jc w:val="right"/>
     </w:pPr>
-    <w:r>
-      <w:rPr>
-        <w:rFonts w:ascii="Calibri" w:hAnsi="Calibri"/>
-        <w:color w:val="5A5A5A"/>
-        <w:sz w:val="18"/>
-      </w:rPr>
-      <w:t xml:space="preserve">The Vinyl Concierge Final Business Report | </w:t>
-    </w:r>
-    <w:r>
-      <w:fldChar w:fldCharType="begin"/>
-      <w:instrText xml:space="preserve">PAGE</w:instrText>
-      <w:fldChar w:fldCharType="end"/>
-    </w:r>
+    <w:r/>
+  </w:p>
+</w:ftr>
+</file>
+
+<file path=word/footer2.xml><?xml version="1.0" encoding="utf-8"?>
+<w:ftr xmlns:m="http://schemas.openxmlformats.org/officeDocument/2006/math" xmlns:mc="http://schemas.openxmlformats.org/markup-compatibility/2006" xmlns:mo="http://schemas.microsoft.com/office/mac/office/2008/main" xmlns:mv="urn:schemas-microsoft-com:mac:vml" xmlns:o="urn:schemas-microsoft-com:office:office" xmlns:r="http://schemas.openxmlformats.org/officeDocument/2006/relationships" xmlns:v="urn:schemas-microsoft-com:vml" xmlns:w10="urn:schemas-microsoft-com:office:word" xmlns:w14="http://schemas.microsoft.com/office/word/2010/wordml" xmlns:w="http://schemas.openxmlformats.org/wordprocessingml/2006/main" xmlns:wne="http://schemas.microsoft.com/office/word/2006/wordml" xmlns:wp14="http://schemas.microsoft.com/office/word/2010/wordprocessingDrawing" xmlns:wp="http://schemas.openxmlformats.org/drawingml/2006/wordprocessingDrawing" xmlns:wpc="http://schemas.microsoft.com/office/word/2010/wordprocessingCanvas" xmlns:wpg="http://schemas.microsoft.com/office/word/2010/wordprocessingGroup" xmlns:wpi="http://schemas.microsoft.com/office/word/2010/wordprocessingInk" xmlns:wps="http://schemas.microsoft.com/office/word/2010/wordprocessingShape" mc:Ignorable="w14 wp14">
+  <w:p>
+    <w:pPr>
+      <w:pStyle w:val="Footer"/>
+    </w:pPr>
+    <w:r/>
+  </w:p>
+</w:ftr>
+</file>
+
+<file path=word/footer3.xml><?xml version="1.0" encoding="utf-8"?>
+<w:ftr xmlns:m="http://schemas.openxmlformats.org/officeDocument/2006/math" xmlns:mc="http://schemas.openxmlformats.org/markup-compatibility/2006" xmlns:mo="http://schemas.microsoft.com/office/mac/office/2008/main" xmlns:mv="urn:schemas-microsoft-com:mac:vml" xmlns:o="urn:schemas-microsoft-com:office:office" xmlns:r="http://schemas.openxmlformats.org/officeDocument/2006/relationships" xmlns:v="urn:schemas-microsoft-com:vml" xmlns:w10="urn:schemas-microsoft-com:office:word" xmlns:w14="http://schemas.microsoft.com/office/word/2010/wordml" xmlns:w="http://schemas.openxmlformats.org/wordprocessingml/2006/main" xmlns:wne="http://schemas.microsoft.com/office/word/2006/wordml" xmlns:wp14="http://schemas.microsoft.com/office/word/2010/wordprocessingDrawing" xmlns:wp="http://schemas.openxmlformats.org/drawingml/2006/wordprocessingDrawing" xmlns:wpc="http://schemas.microsoft.com/office/word/2010/wordprocessingCanvas" xmlns:wpg="http://schemas.microsoft.com/office/word/2010/wordprocessingGroup" xmlns:wpi="http://schemas.microsoft.com/office/word/2010/wordprocessingInk" xmlns:wps="http://schemas.microsoft.com/office/word/2010/wordprocessingShape" mc:Ignorable="w14 wp14">
+  <w:p>
+    <w:pPr>
+      <w:pStyle w:val="Footer"/>
+    </w:pPr>
+    <w:r/>
   </w:p>
 </w:ftr>
 </file>

</xml_diff>